<commit_message>
Rebuild the v6 docx with the new section VI
node was not installed on either machine, so the builder edits could not be
compiled or even syntax-checked. Installed Node 24.20.0 into ~/.local/node
(user-space, no sudo, removable with rm -rf) and the docx package into paper/.

The builder parses (node --check) and runs. Rebuilt document is 24.0 KB against
21.8, with VI-A/VI-B/VI-C present, tables numbered I through IX with no gaps or
duplicates, and the corrected containment sentence in Limitations.

The builder writes a repo-root-relative path, so it must be run from the repo
root, not from paper/. Noted here because running it from paper/ fails with
ENOENT and still exits 0 through a pipe.

node_modules is gitignored; package.json and package-lock.json are tracked so
the build is reproducible.

Co-Authored-By: Claude Opus 5 <noreply@anthropic.com>
Claude-Session: https://claude.ai/code/session_013cuARRCXXyys7CWevaQV2m
</commit_message>
<xml_diff>
--- a/paper/RAG_Faithfulness_v6_evaluators.docx
+++ b/paper/RAG_Faithfulness_v6_evaluators.docx
@@ -4986,7 +4986,1184 @@
           <w:sz w:val="20"/>
           <w:szCs w:val="20"/>
         </w:rPr>
-        <w:t xml:space="preserve">The general statement is that any evaluation population whose membership depends on the system under comparison can transfer an effect from the selection into the measurement. Here the weakest retriever refuses most often, and every refusal lowers its average. All faithfulness results in this paper exclude refusals and are paired on the queries every system answered. Section X notes what that pairing costs.</w:t>
+        <w:t xml:space="preserve">Any evaluation population whose membership depends on the system under comparison can transfer an effect from the selection into the measurement. Here the weakest retriever refuses most often, and every refusal lowers its average. All faithfulness results in this paper exclude refusals and are paired on the queries every system answered.</w:t>
+      </w:r>
+    </w:p>
+    <w:p>
+      <w:pPr>
+        <w:pStyle w:val="Heading2"/>
+        <w:spacing w:after="120" w:before="260"/>
+      </w:pPr>
+      <w:r>
+        <w:rPr>
+          <w:rFonts w:ascii="Times New Roman" w:cs="Times New Roman" w:eastAsia="Times New Roman" w:hAnsi="Times New Roman"/>
+          <w:b/>
+          <w:bCs/>
+          <w:sz w:val="22"/>
+          <w:szCs w:val="22"/>
+        </w:rPr>
+        <w:t xml:space="preserve">VI-A. Membership Is Set by a Grader, and Graders Disagree</w:t>
+      </w:r>
+    </w:p>
+    <w:p>
+      <w:pPr>
+        <w:spacing w:after="120" w:before="0" w:line="276"/>
+      </w:pPr>
+      <w:r>
+        <w:rPr>
+          <w:rFonts w:ascii="Times New Roman" w:cs="Times New Roman" w:eastAsia="Times New Roman" w:hAnsi="Times New Roman"/>
+          <w:sz w:val="20"/>
+          <w:szCs w:val="20"/>
+        </w:rPr>
+        <w:t xml:space="preserve">Excluding refusals requires deciding which answers are refusals, and that decision is made by a rule rather than given by the data. We compare two defensible rules: a string-matching heuristic keyed to the refusal templates the prompts offer, and a judge model shown the question, the reference answers and the answer. They agree on the large majority of rows and disagree consistently at the margin.</w:t>
+      </w:r>
+    </w:p>
+    <w:tbl>
+      <w:tblPr>
+        <w:tblW w:type="dxa" w:w="9000"/>
+        <w:tblBorders>
+          <w:top w:val="single" w:color="auto" w:sz="4"/>
+          <w:left w:val="single" w:color="auto" w:sz="4"/>
+          <w:bottom w:val="single" w:color="auto" w:sz="4"/>
+          <w:right w:val="single" w:color="auto" w:sz="4"/>
+          <w:insideH w:val="single" w:color="auto" w:sz="4"/>
+          <w:insideV w:val="single" w:color="auto" w:sz="4"/>
+        </w:tblBorders>
+      </w:tblPr>
+      <w:tblGrid>
+        <w:gridCol w:w="2700"/>
+        <w:gridCol w:w="1575"/>
+        <w:gridCol w:w="1725"/>
+        <w:gridCol w:w="1500"/>
+        <w:gridCol w:w="1500"/>
+      </w:tblGrid>
+      <w:tr>
+        <w:trPr>
+          <w:tblHeader/>
+        </w:trPr>
+        <w:tc>
+          <w:tcPr>
+            <w:tcW w:type="dxa" w:w="2700"/>
+            <w:shd w:fill="E8E8E8" w:color="auto" w:val="clear"/>
+            <w:tcMar>
+              <w:top w:type="dxa" w:w="60"/>
+              <w:left w:type="dxa" w:w="90"/>
+              <w:bottom w:type="dxa" w:w="60"/>
+              <w:right w:type="dxa" w:w="90"/>
+            </w:tcMar>
+          </w:tcPr>
+          <w:p>
+            <w:pPr>
+              <w:spacing w:after="0" w:line="240"/>
+            </w:pPr>
+            <w:r>
+              <w:rPr>
+                <w:rFonts w:ascii="Times New Roman" w:cs="Times New Roman" w:eastAsia="Times New Roman" w:hAnsi="Times New Roman"/>
+                <w:b/>
+                <w:bCs/>
+                <w:sz w:val="18"/>
+                <w:szCs w:val="18"/>
+              </w:rPr>
+              <w:t xml:space="preserve">HotpotQA, Claude</w:t>
+            </w:r>
+          </w:p>
+        </w:tc>
+        <w:tc>
+          <w:tcPr>
+            <w:tcW w:type="dxa" w:w="1575"/>
+            <w:shd w:fill="E8E8E8" w:color="auto" w:val="clear"/>
+            <w:tcMar>
+              <w:top w:type="dxa" w:w="60"/>
+              <w:left w:type="dxa" w:w="90"/>
+              <w:bottom w:type="dxa" w:w="60"/>
+              <w:right w:type="dxa" w:w="90"/>
+            </w:tcMar>
+          </w:tcPr>
+          <w:p>
+            <w:pPr>
+              <w:spacing w:after="0" w:line="240"/>
+            </w:pPr>
+            <w:r>
+              <w:rPr>
+                <w:rFonts w:ascii="Times New Roman" w:cs="Times New Roman" w:eastAsia="Times New Roman" w:hAnsi="Times New Roman"/>
+                <w:b/>
+                <w:bCs/>
+                <w:sz w:val="18"/>
+                <w:szCs w:val="18"/>
+              </w:rPr>
+              <w:t xml:space="preserve">all-mpnet</w:t>
+            </w:r>
+          </w:p>
+        </w:tc>
+        <w:tc>
+          <w:tcPr>
+            <w:tcW w:type="dxa" w:w="1725"/>
+            <w:shd w:fill="E8E8E8" w:color="auto" w:val="clear"/>
+            <w:tcMar>
+              <w:top w:type="dxa" w:w="60"/>
+              <w:left w:type="dxa" w:w="90"/>
+              <w:bottom w:type="dxa" w:w="60"/>
+              <w:right w:type="dxa" w:w="90"/>
+            </w:tcMar>
+          </w:tcPr>
+          <w:p>
+            <w:pPr>
+              <w:spacing w:after="0" w:line="240"/>
+            </w:pPr>
+            <w:r>
+              <w:rPr>
+                <w:rFonts w:ascii="Times New Roman" w:cs="Times New Roman" w:eastAsia="Times New Roman" w:hAnsi="Times New Roman"/>
+                <w:b/>
+                <w:bCs/>
+                <w:sz w:val="18"/>
+                <w:szCs w:val="18"/>
+              </w:rPr>
+              <w:t xml:space="preserve">text-emb-3-small</w:t>
+            </w:r>
+          </w:p>
+        </w:tc>
+        <w:tc>
+          <w:tcPr>
+            <w:tcW w:type="dxa" w:w="1500"/>
+            <w:shd w:fill="E8E8E8" w:color="auto" w:val="clear"/>
+            <w:tcMar>
+              <w:top w:type="dxa" w:w="60"/>
+              <w:left w:type="dxa" w:w="90"/>
+              <w:bottom w:type="dxa" w:w="60"/>
+              <w:right w:type="dxa" w:w="90"/>
+            </w:tcMar>
+          </w:tcPr>
+          <w:p>
+            <w:pPr>
+              <w:spacing w:after="0" w:line="240"/>
+            </w:pPr>
+            <w:r>
+              <w:rPr>
+                <w:rFonts w:ascii="Times New Roman" w:cs="Times New Roman" w:eastAsia="Times New Roman" w:hAnsi="Times New Roman"/>
+                <w:b/>
+                <w:bCs/>
+                <w:sz w:val="18"/>
+                <w:szCs w:val="18"/>
+              </w:rPr>
+              <w:t xml:space="preserve">BGE-M3</w:t>
+            </w:r>
+          </w:p>
+        </w:tc>
+        <w:tc>
+          <w:tcPr>
+            <w:tcW w:type="dxa" w:w="1500"/>
+            <w:shd w:fill="E8E8E8" w:color="auto" w:val="clear"/>
+            <w:tcMar>
+              <w:top w:type="dxa" w:w="60"/>
+              <w:left w:type="dxa" w:w="90"/>
+              <w:bottom w:type="dxa" w:w="60"/>
+              <w:right w:type="dxa" w:w="90"/>
+            </w:tcMar>
+          </w:tcPr>
+          <w:p>
+            <w:pPr>
+              <w:spacing w:after="0" w:line="240"/>
+            </w:pPr>
+            <w:r>
+              <w:rPr>
+                <w:rFonts w:ascii="Times New Roman" w:cs="Times New Roman" w:eastAsia="Times New Roman" w:hAnsi="Times New Roman"/>
+                <w:b/>
+                <w:bCs/>
+                <w:sz w:val="18"/>
+                <w:szCs w:val="18"/>
+              </w:rPr>
+              <w:t xml:space="preserve">E5-instruct</w:t>
+            </w:r>
+          </w:p>
+        </w:tc>
+      </w:tr>
+      <w:tr>
+        <w:trPr>
+          <w:tblHeader w:val="false"/>
+        </w:trPr>
+        <w:tc>
+          <w:tcPr>
+            <w:tcW w:type="dxa" w:w="2700"/>
+            <w:tcMar>
+              <w:top w:type="dxa" w:w="60"/>
+              <w:left w:type="dxa" w:w="90"/>
+              <w:bottom w:type="dxa" w:w="60"/>
+              <w:right w:type="dxa" w:w="90"/>
+            </w:tcMar>
+          </w:tcPr>
+          <w:p>
+            <w:pPr>
+              <w:spacing w:after="0" w:line="240"/>
+            </w:pPr>
+            <w:r>
+              <w:rPr>
+                <w:rFonts w:ascii="Times New Roman" w:cs="Times New Roman" w:eastAsia="Times New Roman" w:hAnsi="Times New Roman"/>
+                <w:b w:val="false"/>
+                <w:bCs w:val="false"/>
+                <w:sz w:val="18"/>
+                <w:szCs w:val="18"/>
+              </w:rPr>
+              <w:t xml:space="preserve">Refusal rate, heuristic</w:t>
+            </w:r>
+          </w:p>
+        </w:tc>
+        <w:tc>
+          <w:tcPr>
+            <w:tcW w:type="dxa" w:w="1575"/>
+            <w:tcMar>
+              <w:top w:type="dxa" w:w="60"/>
+              <w:left w:type="dxa" w:w="90"/>
+              <w:bottom w:type="dxa" w:w="60"/>
+              <w:right w:type="dxa" w:w="90"/>
+            </w:tcMar>
+          </w:tcPr>
+          <w:p>
+            <w:pPr>
+              <w:spacing w:after="0" w:line="240"/>
+            </w:pPr>
+            <w:r>
+              <w:rPr>
+                <w:rFonts w:ascii="Times New Roman" w:cs="Times New Roman" w:eastAsia="Times New Roman" w:hAnsi="Times New Roman"/>
+                <w:b w:val="false"/>
+                <w:bCs w:val="false"/>
+                <w:sz w:val="18"/>
+                <w:szCs w:val="18"/>
+              </w:rPr>
+              <w:t xml:space="preserve">0.376</w:t>
+            </w:r>
+          </w:p>
+        </w:tc>
+        <w:tc>
+          <w:tcPr>
+            <w:tcW w:type="dxa" w:w="1725"/>
+            <w:tcMar>
+              <w:top w:type="dxa" w:w="60"/>
+              <w:left w:type="dxa" w:w="90"/>
+              <w:bottom w:type="dxa" w:w="60"/>
+              <w:right w:type="dxa" w:w="90"/>
+            </w:tcMar>
+          </w:tcPr>
+          <w:p>
+            <w:pPr>
+              <w:spacing w:after="0" w:line="240"/>
+            </w:pPr>
+            <w:r>
+              <w:rPr>
+                <w:rFonts w:ascii="Times New Roman" w:cs="Times New Roman" w:eastAsia="Times New Roman" w:hAnsi="Times New Roman"/>
+                <w:b w:val="false"/>
+                <w:bCs w:val="false"/>
+                <w:sz w:val="18"/>
+                <w:szCs w:val="18"/>
+              </w:rPr>
+              <w:t xml:space="preserve">0.279</w:t>
+            </w:r>
+          </w:p>
+        </w:tc>
+        <w:tc>
+          <w:tcPr>
+            <w:tcW w:type="dxa" w:w="1500"/>
+            <w:tcMar>
+              <w:top w:type="dxa" w:w="60"/>
+              <w:left w:type="dxa" w:w="90"/>
+              <w:bottom w:type="dxa" w:w="60"/>
+              <w:right w:type="dxa" w:w="90"/>
+            </w:tcMar>
+          </w:tcPr>
+          <w:p>
+            <w:pPr>
+              <w:spacing w:after="0" w:line="240"/>
+            </w:pPr>
+            <w:r>
+              <w:rPr>
+                <w:rFonts w:ascii="Times New Roman" w:cs="Times New Roman" w:eastAsia="Times New Roman" w:hAnsi="Times New Roman"/>
+                <w:b w:val="false"/>
+                <w:bCs w:val="false"/>
+                <w:sz w:val="18"/>
+                <w:szCs w:val="18"/>
+              </w:rPr>
+              <w:t xml:space="preserve">0.224</w:t>
+            </w:r>
+          </w:p>
+        </w:tc>
+        <w:tc>
+          <w:tcPr>
+            <w:tcW w:type="dxa" w:w="1500"/>
+            <w:tcMar>
+              <w:top w:type="dxa" w:w="60"/>
+              <w:left w:type="dxa" w:w="90"/>
+              <w:bottom w:type="dxa" w:w="60"/>
+              <w:right w:type="dxa" w:w="90"/>
+            </w:tcMar>
+          </w:tcPr>
+          <w:p>
+            <w:pPr>
+              <w:spacing w:after="0" w:line="240"/>
+            </w:pPr>
+            <w:r>
+              <w:rPr>
+                <w:rFonts w:ascii="Times New Roman" w:cs="Times New Roman" w:eastAsia="Times New Roman" w:hAnsi="Times New Roman"/>
+                <w:b w:val="false"/>
+                <w:bCs w:val="false"/>
+                <w:sz w:val="18"/>
+                <w:szCs w:val="18"/>
+              </w:rPr>
+              <w:t xml:space="preserve">0.207</w:t>
+            </w:r>
+          </w:p>
+        </w:tc>
+      </w:tr>
+      <w:tr>
+        <w:trPr>
+          <w:tblHeader w:val="false"/>
+        </w:trPr>
+        <w:tc>
+          <w:tcPr>
+            <w:tcW w:type="dxa" w:w="2700"/>
+            <w:tcMar>
+              <w:top w:type="dxa" w:w="60"/>
+              <w:left w:type="dxa" w:w="90"/>
+              <w:bottom w:type="dxa" w:w="60"/>
+              <w:right w:type="dxa" w:w="90"/>
+            </w:tcMar>
+          </w:tcPr>
+          <w:p>
+            <w:pPr>
+              <w:spacing w:after="0" w:line="240"/>
+            </w:pPr>
+            <w:r>
+              <w:rPr>
+                <w:rFonts w:ascii="Times New Roman" w:cs="Times New Roman" w:eastAsia="Times New Roman" w:hAnsi="Times New Roman"/>
+                <w:b w:val="false"/>
+                <w:bCs w:val="false"/>
+                <w:sz w:val="18"/>
+                <w:szCs w:val="18"/>
+              </w:rPr>
+              <w:t xml:space="preserve">Refusal rate, judge</w:t>
+            </w:r>
+          </w:p>
+        </w:tc>
+        <w:tc>
+          <w:tcPr>
+            <w:tcW w:type="dxa" w:w="1575"/>
+            <w:tcMar>
+              <w:top w:type="dxa" w:w="60"/>
+              <w:left w:type="dxa" w:w="90"/>
+              <w:bottom w:type="dxa" w:w="60"/>
+              <w:right w:type="dxa" w:w="90"/>
+            </w:tcMar>
+          </w:tcPr>
+          <w:p>
+            <w:pPr>
+              <w:spacing w:after="0" w:line="240"/>
+            </w:pPr>
+            <w:r>
+              <w:rPr>
+                <w:rFonts w:ascii="Times New Roman" w:cs="Times New Roman" w:eastAsia="Times New Roman" w:hAnsi="Times New Roman"/>
+                <w:b w:val="false"/>
+                <w:bCs w:val="false"/>
+                <w:sz w:val="18"/>
+                <w:szCs w:val="18"/>
+              </w:rPr>
+              <w:t xml:space="preserve">0.422</w:t>
+            </w:r>
+          </w:p>
+        </w:tc>
+        <w:tc>
+          <w:tcPr>
+            <w:tcW w:type="dxa" w:w="1725"/>
+            <w:tcMar>
+              <w:top w:type="dxa" w:w="60"/>
+              <w:left w:type="dxa" w:w="90"/>
+              <w:bottom w:type="dxa" w:w="60"/>
+              <w:right w:type="dxa" w:w="90"/>
+            </w:tcMar>
+          </w:tcPr>
+          <w:p>
+            <w:pPr>
+              <w:spacing w:after="0" w:line="240"/>
+            </w:pPr>
+            <w:r>
+              <w:rPr>
+                <w:rFonts w:ascii="Times New Roman" w:cs="Times New Roman" w:eastAsia="Times New Roman" w:hAnsi="Times New Roman"/>
+                <w:b w:val="false"/>
+                <w:bCs w:val="false"/>
+                <w:sz w:val="18"/>
+                <w:szCs w:val="18"/>
+              </w:rPr>
+              <w:t xml:space="preserve">0.332</w:t>
+            </w:r>
+          </w:p>
+        </w:tc>
+        <w:tc>
+          <w:tcPr>
+            <w:tcW w:type="dxa" w:w="1500"/>
+            <w:tcMar>
+              <w:top w:type="dxa" w:w="60"/>
+              <w:left w:type="dxa" w:w="90"/>
+              <w:bottom w:type="dxa" w:w="60"/>
+              <w:right w:type="dxa" w:w="90"/>
+            </w:tcMar>
+          </w:tcPr>
+          <w:p>
+            <w:pPr>
+              <w:spacing w:after="0" w:line="240"/>
+            </w:pPr>
+            <w:r>
+              <w:rPr>
+                <w:rFonts w:ascii="Times New Roman" w:cs="Times New Roman" w:eastAsia="Times New Roman" w:hAnsi="Times New Roman"/>
+                <w:b w:val="false"/>
+                <w:bCs w:val="false"/>
+                <w:sz w:val="18"/>
+                <w:szCs w:val="18"/>
+              </w:rPr>
+              <w:t xml:space="preserve">0.277</w:t>
+            </w:r>
+          </w:p>
+        </w:tc>
+        <w:tc>
+          <w:tcPr>
+            <w:tcW w:type="dxa" w:w="1500"/>
+            <w:tcMar>
+              <w:top w:type="dxa" w:w="60"/>
+              <w:left w:type="dxa" w:w="90"/>
+              <w:bottom w:type="dxa" w:w="60"/>
+              <w:right w:type="dxa" w:w="90"/>
+            </w:tcMar>
+          </w:tcPr>
+          <w:p>
+            <w:pPr>
+              <w:spacing w:after="0" w:line="240"/>
+            </w:pPr>
+            <w:r>
+              <w:rPr>
+                <w:rFonts w:ascii="Times New Roman" w:cs="Times New Roman" w:eastAsia="Times New Roman" w:hAnsi="Times New Roman"/>
+                <w:b w:val="false"/>
+                <w:bCs w:val="false"/>
+                <w:sz w:val="18"/>
+                <w:szCs w:val="18"/>
+              </w:rPr>
+              <w:t xml:space="preserve">0.252</w:t>
+            </w:r>
+          </w:p>
+        </w:tc>
+      </w:tr>
+    </w:tbl>
+    <w:p>
+      <w:pPr>
+        <w:spacing w:after="180" w:before="100"/>
+      </w:pPr>
+      <w:r>
+        <w:rPr>
+          <w:rFonts w:ascii="Times New Roman" w:cs="Times New Roman" w:eastAsia="Times New Roman" w:hAnsi="Times New Roman"/>
+          <w:i/>
+          <w:iCs/>
+          <w:sz w:val="17"/>
+          <w:szCs w:val="17"/>
+        </w:rPr>
+        <w:t xml:space="preserve">Table V. Two refusal detectors on the same answers. The judge finds roughly four to five more refusals per hundred answers in every column, so the disagreement is a level shift rather than noise, and it does not reorder the systems.</w:t>
+      </w:r>
+    </w:p>
+    <w:p>
+      <w:pPr>
+        <w:spacing w:after="140" w:before="0" w:line="276"/>
+      </w:pPr>
+      <w:r>
+        <w:rPr>
+          <w:rFonts w:ascii="Times New Roman" w:cs="Times New Roman" w:eastAsia="Times New Roman" w:hAnsi="Times New Roman"/>
+          <w:sz w:val="20"/>
+          <w:szCs w:val="20"/>
+        </w:rPr>
+        <w:t xml:space="preserve">A uniform shift that preserves the ordering would ordinarily be unremarkable. It is not unremarkable here, because the excluded rows are not a random sample of the population: they are the rows nearest the boundary between refusing and attempting. Substituting one detector for the other moves nineteen rows on Natural Questions with Claude and fifty-five on HotpotQA with Claude, and changes the significance verdict in two of the eight dataset-generator-evaluator cells. Under the entailment aggregate, Natural Questions with Claude moves from no detectable difference (p = 0.223) to a detectable one (p = 0.048); under AlignScore, HotpotQA with Claude moves from p = 0.151 to p = 0.049. Both land within a thousandth of the conventional threshold, which is the point: the verdict in these cells is not a property of the systems.</w:t>
+      </w:r>
+    </w:p>
+    <w:p>
+      <w:pPr>
+        <w:spacing w:after="160" w:before="0" w:line="276"/>
+      </w:pPr>
+      <w:r>
+        <w:rPr>
+          <w:rFonts w:ascii="Times New Roman" w:cs="Times New Roman" w:eastAsia="Times New Roman" w:hAnsi="Times New Roman"/>
+          <w:sz w:val="20"/>
+          <w:szCs w:val="20"/>
+        </w:rPr>
+        <w:t xml:space="preserve">The count is more stable than the cells. Two of four dataset-generator cells change verdict between evaluators under either detector, but not the same two. We therefore report the count as the finding and treat any individual cell as undetermined.</w:t>
+      </w:r>
+    </w:p>
+    <w:p>
+      <w:pPr>
+        <w:pStyle w:val="Heading2"/>
+        <w:spacing w:after="120" w:before="260"/>
+      </w:pPr>
+      <w:r>
+        <w:rPr>
+          <w:rFonts w:ascii="Times New Roman" w:cs="Times New Roman" w:eastAsia="Times New Roman" w:hAnsi="Times New Roman"/>
+          <w:b/>
+          <w:bCs/>
+          <w:sz w:val="22"/>
+          <w:szCs w:val="22"/>
+        </w:rPr>
+        <w:t xml:space="preserve">VI-B. The Correctness Grader Admits Refusals to the Wrong Population</w:t>
+      </w:r>
+    </w:p>
+    <w:p>
+      <w:pPr>
+        <w:spacing w:after="140" w:before="0" w:line="276"/>
+      </w:pPr>
+      <w:r>
+        <w:rPr>
+          <w:rFonts w:ascii="Times New Roman" w:cs="Times New Roman" w:eastAsia="Times New Roman" w:hAnsi="Times New Roman"/>
+          <w:sz w:val="20"/>
+          <w:szCs w:val="20"/>
+        </w:rPr>
+        <w:t xml:space="preserve">The same problem appears once faithfulness is conditioned on correctness. String containment grades an answer correct when a reference answer string occurs in it, and a short reference string can occur inside a refusal. On a 200-answer calibration, ten refusals were graded correct by containment and the judge overturned nine of them. A refusal admitted to the correct population carries a near-floor faithfulness score into the correct-answer average, which lowers the baseline that any correct-versus-incorrect comparison is measured against. Under graded judgement no refusal is graded correct in any of the sixteen cells.</w:t>
+      </w:r>
+    </w:p>
+    <w:p>
+      <w:pPr>
+        <w:spacing w:after="140" w:before="0" w:line="276"/>
+      </w:pPr>
+      <w:r>
+        <w:rPr>
+          <w:rFonts w:ascii="Times New Roman" w:cs="Times New Roman" w:eastAsia="Times New Roman" w:hAnsi="Times New Roman"/>
+          <w:sz w:val="20"/>
+          <w:szCs w:val="20"/>
+        </w:rPr>
+        <w:t xml:space="preserve">The effect is large enough to change a sign. Measured with containment and a baseline that excluded refusals from the incorrect side only, answers on Natural Questions with Claude appeared more grounded when wrong than when right, by 0.018 to 0.050 across the four systems. Excluding refusals from both sides reduces this to between -0.006 and +0.018. Grading correctness with the judge instead of containment moves it to between -0.051 and -0.113, in the opposite direction. Each of the three steps is a correction to the grader rather than a change to the answers, and all three move the quantity the same way.</w:t>
+      </w:r>
+    </w:p>
+    <w:p>
+      <w:pPr>
+        <w:spacing w:after="160" w:before="0" w:line="276"/>
+      </w:pPr>
+      <w:r>
+        <w:rPr>
+          <w:rFonts w:ascii="Times New Roman" w:cs="Times New Roman" w:eastAsia="Times New Roman" w:hAnsi="Times New Roman"/>
+          <w:sz w:val="20"/>
+          <w:szCs w:val="20"/>
+        </w:rPr>
+        <w:t xml:space="preserve">Tested directly, no positive value of this quantity survives. Across all sixteen cells a two-sample permutation test with Holm correction finds three significant, all negative, and none of the eight positive-signed cells has a confidence interval excluding zero. The clearest single result is E5-instruct on Natural Questions, where the same effect appears under both generators (-0.113 and -0.115). We report no evidence that answers are more grounded when they are wrong. The intervals are wide, between 0.08 and 0.13, because only 44 to 84 wrong answered rows remain per cell once refusals are excluded; these tests bear on the general claim and not on individual systems.</w:t>
+      </w:r>
+    </w:p>
+    <w:p>
+      <w:pPr>
+        <w:pStyle w:val="Heading2"/>
+        <w:spacing w:after="120" w:before="260"/>
+      </w:pPr>
+      <w:r>
+        <w:rPr>
+          <w:rFonts w:ascii="Times New Roman" w:cs="Times New Roman" w:eastAsia="Times New Roman" w:hAnsi="Times New Roman"/>
+          <w:b/>
+          <w:bCs/>
+          <w:sz w:val="22"/>
+          <w:szCs w:val="22"/>
+        </w:rPr>
+        <w:t xml:space="preserve">VI-C. A Contingency Cell That Mostly Counts Refusals</w:t>
+      </w:r>
+    </w:p>
+    <w:p>
+      <w:pPr>
+        <w:spacing w:after="120" w:before="0" w:line="276"/>
+      </w:pPr>
+      <w:r>
+        <w:rPr>
+          <w:rFonts w:ascii="Times New Roman" w:cs="Times New Roman" w:eastAsia="Times New Roman" w:hAnsi="Times New Roman"/>
+          <w:sz w:val="20"/>
+          <w:szCs w:val="20"/>
+        </w:rPr>
+        <w:t xml:space="preserve">The same accounting governs the contingency between retrieval success and correctness. The cell in which retrieval succeeded and the answer was still wrong is the one that bears on whether retrieval quality is sufficient, and most of it consists of answers that were never attempted.</w:t>
+      </w:r>
+    </w:p>
+    <w:tbl>
+      <w:tblPr>
+        <w:tblW w:type="dxa" w:w="9000"/>
+        <w:tblBorders>
+          <w:top w:val="single" w:color="auto" w:sz="4"/>
+          <w:left w:val="single" w:color="auto" w:sz="4"/>
+          <w:bottom w:val="single" w:color="auto" w:sz="4"/>
+          <w:right w:val="single" w:color="auto" w:sz="4"/>
+          <w:insideH w:val="single" w:color="auto" w:sz="4"/>
+          <w:insideV w:val="single" w:color="auto" w:sz="4"/>
+        </w:tblBorders>
+      </w:tblPr>
+      <w:tblGrid>
+        <w:gridCol w:w="3300"/>
+        <w:gridCol w:w="1425"/>
+        <w:gridCol w:w="1425"/>
+        <w:gridCol w:w="1425"/>
+        <w:gridCol w:w="1425"/>
+      </w:tblGrid>
+      <w:tr>
+        <w:trPr>
+          <w:tblHeader/>
+        </w:trPr>
+        <w:tc>
+          <w:tcPr>
+            <w:tcW w:type="dxa" w:w="3300"/>
+            <w:shd w:fill="E8E8E8" w:color="auto" w:val="clear"/>
+            <w:tcMar>
+              <w:top w:type="dxa" w:w="60"/>
+              <w:left w:type="dxa" w:w="90"/>
+              <w:bottom w:type="dxa" w:w="60"/>
+              <w:right w:type="dxa" w:w="90"/>
+            </w:tcMar>
+          </w:tcPr>
+          <w:p>
+            <w:pPr>
+              <w:spacing w:after="0" w:line="240"/>
+            </w:pPr>
+            <w:r>
+              <w:rPr>
+                <w:rFonts w:ascii="Times New Roman" w:cs="Times New Roman" w:eastAsia="Times New Roman" w:hAnsi="Times New Roman"/>
+                <w:b/>
+                <w:bCs/>
+                <w:sz w:val="18"/>
+                <w:szCs w:val="18"/>
+              </w:rPr>
+              <w:t xml:space="preserve">Retrieval hit and answer incorrect</w:t>
+            </w:r>
+          </w:p>
+        </w:tc>
+        <w:tc>
+          <w:tcPr>
+            <w:tcW w:type="dxa" w:w="1425"/>
+            <w:shd w:fill="E8E8E8" w:color="auto" w:val="clear"/>
+            <w:tcMar>
+              <w:top w:type="dxa" w:w="60"/>
+              <w:left w:type="dxa" w:w="90"/>
+              <w:bottom w:type="dxa" w:w="60"/>
+              <w:right w:type="dxa" w:w="90"/>
+            </w:tcMar>
+          </w:tcPr>
+          <w:p>
+            <w:pPr>
+              <w:spacing w:after="0" w:line="240"/>
+            </w:pPr>
+            <w:r>
+              <w:rPr>
+                <w:rFonts w:ascii="Times New Roman" w:cs="Times New Roman" w:eastAsia="Times New Roman" w:hAnsi="Times New Roman"/>
+                <w:b/>
+                <w:bCs/>
+                <w:sz w:val="18"/>
+                <w:szCs w:val="18"/>
+              </w:rPr>
+              <w:t xml:space="preserve">Claude, NQ</w:t>
+            </w:r>
+          </w:p>
+        </w:tc>
+        <w:tc>
+          <w:tcPr>
+            <w:tcW w:type="dxa" w:w="1425"/>
+            <w:shd w:fill="E8E8E8" w:color="auto" w:val="clear"/>
+            <w:tcMar>
+              <w:top w:type="dxa" w:w="60"/>
+              <w:left w:type="dxa" w:w="90"/>
+              <w:bottom w:type="dxa" w:w="60"/>
+              <w:right w:type="dxa" w:w="90"/>
+            </w:tcMar>
+          </w:tcPr>
+          <w:p>
+            <w:pPr>
+              <w:spacing w:after="0" w:line="240"/>
+            </w:pPr>
+            <w:r>
+              <w:rPr>
+                <w:rFonts w:ascii="Times New Roman" w:cs="Times New Roman" w:eastAsia="Times New Roman" w:hAnsi="Times New Roman"/>
+                <w:b/>
+                <w:bCs/>
+                <w:sz w:val="18"/>
+                <w:szCs w:val="18"/>
+              </w:rPr>
+              <w:t xml:space="preserve">Claude, HQA</w:t>
+            </w:r>
+          </w:p>
+        </w:tc>
+        <w:tc>
+          <w:tcPr>
+            <w:tcW w:type="dxa" w:w="1425"/>
+            <w:shd w:fill="E8E8E8" w:color="auto" w:val="clear"/>
+            <w:tcMar>
+              <w:top w:type="dxa" w:w="60"/>
+              <w:left w:type="dxa" w:w="90"/>
+              <w:bottom w:type="dxa" w:w="60"/>
+              <w:right w:type="dxa" w:w="90"/>
+            </w:tcMar>
+          </w:tcPr>
+          <w:p>
+            <w:pPr>
+              <w:spacing w:after="0" w:line="240"/>
+            </w:pPr>
+            <w:r>
+              <w:rPr>
+                <w:rFonts w:ascii="Times New Roman" w:cs="Times New Roman" w:eastAsia="Times New Roman" w:hAnsi="Times New Roman"/>
+                <w:b/>
+                <w:bCs/>
+                <w:sz w:val="18"/>
+                <w:szCs w:val="18"/>
+              </w:rPr>
+              <w:t xml:space="preserve">GPT, NQ</w:t>
+            </w:r>
+          </w:p>
+        </w:tc>
+        <w:tc>
+          <w:tcPr>
+            <w:tcW w:type="dxa" w:w="1425"/>
+            <w:shd w:fill="E8E8E8" w:color="auto" w:val="clear"/>
+            <w:tcMar>
+              <w:top w:type="dxa" w:w="60"/>
+              <w:left w:type="dxa" w:w="90"/>
+              <w:bottom w:type="dxa" w:w="60"/>
+              <w:right w:type="dxa" w:w="90"/>
+            </w:tcMar>
+          </w:tcPr>
+          <w:p>
+            <w:pPr>
+              <w:spacing w:after="0" w:line="240"/>
+            </w:pPr>
+            <w:r>
+              <w:rPr>
+                <w:rFonts w:ascii="Times New Roman" w:cs="Times New Roman" w:eastAsia="Times New Roman" w:hAnsi="Times New Roman"/>
+                <w:b/>
+                <w:bCs/>
+                <w:sz w:val="18"/>
+                <w:szCs w:val="18"/>
+              </w:rPr>
+              <w:t xml:space="preserve">GPT, HQA</w:t>
+            </w:r>
+          </w:p>
+        </w:tc>
+      </w:tr>
+      <w:tr>
+        <w:trPr>
+          <w:tblHeader w:val="false"/>
+        </w:trPr>
+        <w:tc>
+          <w:tcPr>
+            <w:tcW w:type="dxa" w:w="3300"/>
+            <w:tcMar>
+              <w:top w:type="dxa" w:w="60"/>
+              <w:left w:type="dxa" w:w="90"/>
+              <w:bottom w:type="dxa" w:w="60"/>
+              <w:right w:type="dxa" w:w="90"/>
+            </w:tcMar>
+          </w:tcPr>
+          <w:p>
+            <w:pPr>
+              <w:spacing w:after="0" w:line="240"/>
+            </w:pPr>
+            <w:r>
+              <w:rPr>
+                <w:rFonts w:ascii="Times New Roman" w:cs="Times New Roman" w:eastAsia="Times New Roman" w:hAnsi="Times New Roman"/>
+                <w:b w:val="false"/>
+                <w:bCs w:val="false"/>
+                <w:sz w:val="18"/>
+                <w:szCs w:val="18"/>
+              </w:rPr>
+              <w:t xml:space="preserve">Share of all queries</w:t>
+            </w:r>
+          </w:p>
+        </w:tc>
+        <w:tc>
+          <w:tcPr>
+            <w:tcW w:type="dxa" w:w="1425"/>
+            <w:tcMar>
+              <w:top w:type="dxa" w:w="60"/>
+              <w:left w:type="dxa" w:w="90"/>
+              <w:bottom w:type="dxa" w:w="60"/>
+              <w:right w:type="dxa" w:w="90"/>
+            </w:tcMar>
+          </w:tcPr>
+          <w:p>
+            <w:pPr>
+              <w:spacing w:after="0" w:line="240"/>
+            </w:pPr>
+            <w:r>
+              <w:rPr>
+                <w:rFonts w:ascii="Times New Roman" w:cs="Times New Roman" w:eastAsia="Times New Roman" w:hAnsi="Times New Roman"/>
+                <w:b w:val="false"/>
+                <w:bCs w:val="false"/>
+                <w:sz w:val="18"/>
+                <w:szCs w:val="18"/>
+              </w:rPr>
+              <w:t xml:space="preserve">17.4%</w:t>
+            </w:r>
+          </w:p>
+        </w:tc>
+        <w:tc>
+          <w:tcPr>
+            <w:tcW w:type="dxa" w:w="1425"/>
+            <w:tcMar>
+              <w:top w:type="dxa" w:w="60"/>
+              <w:left w:type="dxa" w:w="90"/>
+              <w:bottom w:type="dxa" w:w="60"/>
+              <w:right w:type="dxa" w:w="90"/>
+            </w:tcMar>
+          </w:tcPr>
+          <w:p>
+            <w:pPr>
+              <w:spacing w:after="0" w:line="240"/>
+            </w:pPr>
+            <w:r>
+              <w:rPr>
+                <w:rFonts w:ascii="Times New Roman" w:cs="Times New Roman" w:eastAsia="Times New Roman" w:hAnsi="Times New Roman"/>
+                <w:b w:val="false"/>
+                <w:bCs w:val="false"/>
+                <w:sz w:val="18"/>
+                <w:szCs w:val="18"/>
+              </w:rPr>
+              <w:t xml:space="preserve">34.0%</w:t>
+            </w:r>
+          </w:p>
+        </w:tc>
+        <w:tc>
+          <w:tcPr>
+            <w:tcW w:type="dxa" w:w="1425"/>
+            <w:tcMar>
+              <w:top w:type="dxa" w:w="60"/>
+              <w:left w:type="dxa" w:w="90"/>
+              <w:bottom w:type="dxa" w:w="60"/>
+              <w:right w:type="dxa" w:w="90"/>
+            </w:tcMar>
+          </w:tcPr>
+          <w:p>
+            <w:pPr>
+              <w:spacing w:after="0" w:line="240"/>
+            </w:pPr>
+            <w:r>
+              <w:rPr>
+                <w:rFonts w:ascii="Times New Roman" w:cs="Times New Roman" w:eastAsia="Times New Roman" w:hAnsi="Times New Roman"/>
+                <w:b w:val="false"/>
+                <w:bCs w:val="false"/>
+                <w:sz w:val="18"/>
+                <w:szCs w:val="18"/>
+              </w:rPr>
+              <w:t xml:space="preserve">31.7%</w:t>
+            </w:r>
+          </w:p>
+        </w:tc>
+        <w:tc>
+          <w:tcPr>
+            <w:tcW w:type="dxa" w:w="1425"/>
+            <w:tcMar>
+              <w:top w:type="dxa" w:w="60"/>
+              <w:left w:type="dxa" w:w="90"/>
+              <w:bottom w:type="dxa" w:w="60"/>
+              <w:right w:type="dxa" w:w="90"/>
+            </w:tcMar>
+          </w:tcPr>
+          <w:p>
+            <w:pPr>
+              <w:spacing w:after="0" w:line="240"/>
+            </w:pPr>
+            <w:r>
+              <w:rPr>
+                <w:rFonts w:ascii="Times New Roman" w:cs="Times New Roman" w:eastAsia="Times New Roman" w:hAnsi="Times New Roman"/>
+                <w:b w:val="false"/>
+                <w:bCs w:val="false"/>
+                <w:sz w:val="18"/>
+                <w:szCs w:val="18"/>
+              </w:rPr>
+              <w:t xml:space="preserve">36.3%</w:t>
+            </w:r>
+          </w:p>
+        </w:tc>
+      </w:tr>
+      <w:tr>
+        <w:trPr>
+          <w:tblHeader w:val="false"/>
+        </w:trPr>
+        <w:tc>
+          <w:tcPr>
+            <w:tcW w:type="dxa" w:w="3300"/>
+            <w:tcMar>
+              <w:top w:type="dxa" w:w="60"/>
+              <w:left w:type="dxa" w:w="90"/>
+              <w:bottom w:type="dxa" w:w="60"/>
+              <w:right w:type="dxa" w:w="90"/>
+            </w:tcMar>
+          </w:tcPr>
+          <w:p>
+            <w:pPr>
+              <w:spacing w:after="0" w:line="240"/>
+            </w:pPr>
+            <w:r>
+              <w:rPr>
+                <w:rFonts w:ascii="Times New Roman" w:cs="Times New Roman" w:eastAsia="Times New Roman" w:hAnsi="Times New Roman"/>
+                <w:b w:val="false"/>
+                <w:bCs w:val="false"/>
+                <w:sz w:val="18"/>
+                <w:szCs w:val="18"/>
+              </w:rPr>
+              <w:t xml:space="preserve">Of that cell, refusals</w:t>
+            </w:r>
+          </w:p>
+        </w:tc>
+        <w:tc>
+          <w:tcPr>
+            <w:tcW w:type="dxa" w:w="1425"/>
+            <w:tcMar>
+              <w:top w:type="dxa" w:w="60"/>
+              <w:left w:type="dxa" w:w="90"/>
+              <w:bottom w:type="dxa" w:w="60"/>
+              <w:right w:type="dxa" w:w="90"/>
+            </w:tcMar>
+          </w:tcPr>
+          <w:p>
+            <w:pPr>
+              <w:spacing w:after="0" w:line="240"/>
+            </w:pPr>
+            <w:r>
+              <w:rPr>
+                <w:rFonts w:ascii="Times New Roman" w:cs="Times New Roman" w:eastAsia="Times New Roman" w:hAnsi="Times New Roman"/>
+                <w:b w:val="false"/>
+                <w:bCs w:val="false"/>
+                <w:sz w:val="18"/>
+                <w:szCs w:val="18"/>
+              </w:rPr>
+              <w:t xml:space="preserve">69.3%</w:t>
+            </w:r>
+          </w:p>
+        </w:tc>
+        <w:tc>
+          <w:tcPr>
+            <w:tcW w:type="dxa" w:w="1425"/>
+            <w:tcMar>
+              <w:top w:type="dxa" w:w="60"/>
+              <w:left w:type="dxa" w:w="90"/>
+              <w:bottom w:type="dxa" w:w="60"/>
+              <w:right w:type="dxa" w:w="90"/>
+            </w:tcMar>
+          </w:tcPr>
+          <w:p>
+            <w:pPr>
+              <w:spacing w:after="0" w:line="240"/>
+            </w:pPr>
+            <w:r>
+              <w:rPr>
+                <w:rFonts w:ascii="Times New Roman" w:cs="Times New Roman" w:eastAsia="Times New Roman" w:hAnsi="Times New Roman"/>
+                <w:b w:val="false"/>
+                <w:bCs w:val="false"/>
+                <w:sz w:val="18"/>
+                <w:szCs w:val="18"/>
+              </w:rPr>
+              <w:t xml:space="preserve">86.8%</w:t>
+            </w:r>
+          </w:p>
+        </w:tc>
+        <w:tc>
+          <w:tcPr>
+            <w:tcW w:type="dxa" w:w="1425"/>
+            <w:tcMar>
+              <w:top w:type="dxa" w:w="60"/>
+              <w:left w:type="dxa" w:w="90"/>
+              <w:bottom w:type="dxa" w:w="60"/>
+              <w:right w:type="dxa" w:w="90"/>
+            </w:tcMar>
+          </w:tcPr>
+          <w:p>
+            <w:pPr>
+              <w:spacing w:after="0" w:line="240"/>
+            </w:pPr>
+            <w:r>
+              <w:rPr>
+                <w:rFonts w:ascii="Times New Roman" w:cs="Times New Roman" w:eastAsia="Times New Roman" w:hAnsi="Times New Roman"/>
+                <w:b w:val="false"/>
+                <w:bCs w:val="false"/>
+                <w:sz w:val="18"/>
+                <w:szCs w:val="18"/>
+              </w:rPr>
+              <w:t xml:space="preserve">79.0%</w:t>
+            </w:r>
+          </w:p>
+        </w:tc>
+        <w:tc>
+          <w:tcPr>
+            <w:tcW w:type="dxa" w:w="1425"/>
+            <w:tcMar>
+              <w:top w:type="dxa" w:w="60"/>
+              <w:left w:type="dxa" w:w="90"/>
+              <w:bottom w:type="dxa" w:w="60"/>
+              <w:right w:type="dxa" w:w="90"/>
+            </w:tcMar>
+          </w:tcPr>
+          <w:p>
+            <w:pPr>
+              <w:spacing w:after="0" w:line="240"/>
+            </w:pPr>
+            <w:r>
+              <w:rPr>
+                <w:rFonts w:ascii="Times New Roman" w:cs="Times New Roman" w:eastAsia="Times New Roman" w:hAnsi="Times New Roman"/>
+                <w:b w:val="false"/>
+                <w:bCs w:val="false"/>
+                <w:sz w:val="18"/>
+                <w:szCs w:val="18"/>
+              </w:rPr>
+              <w:t xml:space="preserve">78.1%</w:t>
+            </w:r>
+          </w:p>
+        </w:tc>
+      </w:tr>
+      <w:tr>
+        <w:trPr>
+          <w:tblHeader w:val="false"/>
+        </w:trPr>
+        <w:tc>
+          <w:tcPr>
+            <w:tcW w:type="dxa" w:w="3300"/>
+            <w:tcMar>
+              <w:top w:type="dxa" w:w="60"/>
+              <w:left w:type="dxa" w:w="90"/>
+              <w:bottom w:type="dxa" w:w="60"/>
+              <w:right w:type="dxa" w:w="90"/>
+            </w:tcMar>
+          </w:tcPr>
+          <w:p>
+            <w:pPr>
+              <w:spacing w:after="0" w:line="240"/>
+            </w:pPr>
+            <w:r>
+              <w:rPr>
+                <w:rFonts w:ascii="Times New Roman" w:cs="Times New Roman" w:eastAsia="Times New Roman" w:hAnsi="Times New Roman"/>
+                <w:b w:val="false"/>
+                <w:bCs w:val="false"/>
+                <w:sz w:val="18"/>
+                <w:szCs w:val="18"/>
+              </w:rPr>
+              <w:t xml:space="preserve">Attempted and wrong</w:t>
+            </w:r>
+          </w:p>
+        </w:tc>
+        <w:tc>
+          <w:tcPr>
+            <w:tcW w:type="dxa" w:w="1425"/>
+            <w:tcMar>
+              <w:top w:type="dxa" w:w="60"/>
+              <w:left w:type="dxa" w:w="90"/>
+              <w:bottom w:type="dxa" w:w="60"/>
+              <w:right w:type="dxa" w:w="90"/>
+            </w:tcMar>
+          </w:tcPr>
+          <w:p>
+            <w:pPr>
+              <w:spacing w:after="0" w:line="240"/>
+            </w:pPr>
+            <w:r>
+              <w:rPr>
+                <w:rFonts w:ascii="Times New Roman" w:cs="Times New Roman" w:eastAsia="Times New Roman" w:hAnsi="Times New Roman"/>
+                <w:b w:val="false"/>
+                <w:bCs w:val="false"/>
+                <w:sz w:val="18"/>
+                <w:szCs w:val="18"/>
+              </w:rPr>
+              <w:t xml:space="preserve">5.4%</w:t>
+            </w:r>
+          </w:p>
+        </w:tc>
+        <w:tc>
+          <w:tcPr>
+            <w:tcW w:type="dxa" w:w="1425"/>
+            <w:tcMar>
+              <w:top w:type="dxa" w:w="60"/>
+              <w:left w:type="dxa" w:w="90"/>
+              <w:bottom w:type="dxa" w:w="60"/>
+              <w:right w:type="dxa" w:w="90"/>
+            </w:tcMar>
+          </w:tcPr>
+          <w:p>
+            <w:pPr>
+              <w:spacing w:after="0" w:line="240"/>
+            </w:pPr>
+            <w:r>
+              <w:rPr>
+                <w:rFonts w:ascii="Times New Roman" w:cs="Times New Roman" w:eastAsia="Times New Roman" w:hAnsi="Times New Roman"/>
+                <w:b w:val="false"/>
+                <w:bCs w:val="false"/>
+                <w:sz w:val="18"/>
+                <w:szCs w:val="18"/>
+              </w:rPr>
+              <w:t xml:space="preserve">4.5%</w:t>
+            </w:r>
+          </w:p>
+        </w:tc>
+        <w:tc>
+          <w:tcPr>
+            <w:tcW w:type="dxa" w:w="1425"/>
+            <w:tcMar>
+              <w:top w:type="dxa" w:w="60"/>
+              <w:left w:type="dxa" w:w="90"/>
+              <w:bottom w:type="dxa" w:w="60"/>
+              <w:right w:type="dxa" w:w="90"/>
+            </w:tcMar>
+          </w:tcPr>
+          <w:p>
+            <w:pPr>
+              <w:spacing w:after="0" w:line="240"/>
+            </w:pPr>
+            <w:r>
+              <w:rPr>
+                <w:rFonts w:ascii="Times New Roman" w:cs="Times New Roman" w:eastAsia="Times New Roman" w:hAnsi="Times New Roman"/>
+                <w:b w:val="false"/>
+                <w:bCs w:val="false"/>
+                <w:sz w:val="18"/>
+                <w:szCs w:val="18"/>
+              </w:rPr>
+              <w:t xml:space="preserve">6.7%</w:t>
+            </w:r>
+          </w:p>
+        </w:tc>
+        <w:tc>
+          <w:tcPr>
+            <w:tcW w:type="dxa" w:w="1425"/>
+            <w:tcMar>
+              <w:top w:type="dxa" w:w="60"/>
+              <w:left w:type="dxa" w:w="90"/>
+              <w:bottom w:type="dxa" w:w="60"/>
+              <w:right w:type="dxa" w:w="90"/>
+            </w:tcMar>
+          </w:tcPr>
+          <w:p>
+            <w:pPr>
+              <w:spacing w:after="0" w:line="240"/>
+            </w:pPr>
+            <w:r>
+              <w:rPr>
+                <w:rFonts w:ascii="Times New Roman" w:cs="Times New Roman" w:eastAsia="Times New Roman" w:hAnsi="Times New Roman"/>
+                <w:b w:val="false"/>
+                <w:bCs w:val="false"/>
+                <w:sz w:val="18"/>
+                <w:szCs w:val="18"/>
+              </w:rPr>
+              <w:t xml:space="preserve">7.9%</w:t>
+            </w:r>
+          </w:p>
+        </w:tc>
+      </w:tr>
+    </w:tbl>
+    <w:p>
+      <w:pPr>
+        <w:spacing w:after="180" w:before="100"/>
+      </w:pPr>
+      <w:r>
+        <w:rPr>
+          <w:rFonts w:ascii="Times New Roman" w:cs="Times New Roman" w:eastAsia="Times New Roman" w:hAnsi="Times New Roman"/>
+          <w:i/>
+          <w:iCs/>
+          <w:sz w:val="17"/>
+          <w:szCs w:val="17"/>
+        </w:rPr>
+        <w:t xml:space="preserve">Table VI. Correctness from graded judgement. The raw cell is between 17 and 36 per cent of queries; the share that is a grounded, committed, wrong answer is between 4.5 and 7.9 per cent.</w:t>
+      </w:r>
+    </w:p>
+    <w:p>
+      <w:pPr>
+        <w:spacing w:after="160" w:before="0" w:line="276"/>
+      </w:pPr>
+      <w:r>
+        <w:rPr>
+          <w:rFonts w:ascii="Times New Roman" w:cs="Times New Roman" w:eastAsia="Times New Roman" w:hAnsi="Times New Roman"/>
+          <w:sz w:val="20"/>
+          <w:szCs w:val="20"/>
+        </w:rPr>
+        <w:t xml:space="preserve">Read without the decomposition, the raw cell would support the claim that good retrieval frequently fails to produce a correct answer. Most of what it counts is a system declining to answer, and refusal rates differ by more than twenty points across the systems compared. The residual is a real phenomenon and it is roughly a fifth the size the raw cell implies.</w:t>
       </w:r>
     </w:p>
     <w:p>
@@ -5862,7 +7039,7 @@
           <w:sz w:val="17"/>
           <w:szCs w:val="17"/>
         </w:rPr>
-        <w:t xml:space="preserve">Table V. The same comparison under two evaluators. Two of four cells change verdict at alpha = 0.05. Queries, answers, refusal handling and test are identical throughout.</w:t>
+        <w:t xml:space="preserve">Table VII. The same comparison under two evaluators. Two of four cells change verdict at alpha = 0.05. Queries, answers, refusal handling and test are identical throughout.</w:t>
       </w:r>
     </w:p>
     <w:p>
@@ -6349,7 +7526,7 @@
           <w:sz w:val="17"/>
           <w:szCs w:val="17"/>
         </w:rPr>
-        <w:t xml:space="preserve">Table VI. With four systems these coefficients cannot carry significance individually. The pattern is that all four HotpotQA cells are positive and all four Natural Questions cells are zero or negative, across both generators and both evaluators.</w:t>
+        <w:t xml:space="preserve">Table VIII. With four systems these coefficients cannot carry significance individually. The pattern is that all four HotpotQA cells are positive and all four Natural Questions cells are zero or negative, across both generators and both evaluators.</w:t>
       </w:r>
     </w:p>
     <w:p>
@@ -6391,7 +7568,7 @@
           <w:sz w:val="20"/>
           <w:szCs w:val="20"/>
         </w:rPr>
-        <w:t xml:space="preserve">Two of the four cells in Table V show no detectable difference under either evaluator. Absence of a detected difference is not evidence of equivalence, so we test equivalence directly with two one-sided tests [8]. A TOST result depends entirely on the margin, and a margin is a substantive judgement rather than a statistical fact — so we report a curve rather than assert a point.</w:t>
+        <w:t xml:space="preserve">Two of the four cells in Table VII show no detectable difference under either evaluator. Absence of a detected difference is not evidence of equivalence, so we test equivalence directly with two one-sided tests [8]. A TOST result depends entirely on the margin, and a margin is a substantive judgement rather than a statistical fact — so we report a curve rather than assert a point.</w:t>
       </w:r>
     </w:p>
     <w:tbl>
@@ -8118,7 +9295,7 @@
           <w:sz w:val="17"/>
           <w:szCs w:val="17"/>
         </w:rPr>
-        <w:t xml:space="preserve">Table VII. System pairs judged equivalent, of six tested, across margins. A claim of equivalence is a claim about a particular column.</w:t>
+        <w:t xml:space="preserve">Table IX. System pairs judged equivalent, of six tested, across margins. A claim of equivalence is a claim about a particular column.</w:t>
       </w:r>
     </w:p>
     <w:p>
@@ -8297,7 +9474,7 @@
           <w:sz w:val="20"/>
           <w:szCs w:val="20"/>
         </w:rPr>
-        <w:t xml:space="preserve">Correctness figures are provisional. Exact match is 0.000 across all 4,000 Claude Natural Questions answers because the generators do not emit bare answer spans, and token F1 is 0.121 for the same reason, so correctness currently rests on string containment, an upper bound. A graded judgement is implemented but not yet run. Table VIII is reported for completeness and should not be cited as a measurement.</w:t>
+        <w:t xml:space="preserve">Correctness is graded by a judge model rather than by string overlap. Exact match is 0.000 across all 16,000 answers because the generators do not emit bare answer spans. String containment, the obvious fallback, is not a bound in either direction: against the judge it understates accuracy by 5 to 15 points in twelve cells and overstates it by 3 to 7 points in the four HotpotQA cells under Claude, where long answers mention a reference string while asserting something else. The judge is itself a language model applied to its own outputs, and its agreement with a human annotator on this data has not been established.</w:t>
       </w:r>
     </w:p>
     <w:p>
@@ -8374,7 +9551,12 @@
     </w:p>
     <w:p>
       <w:pPr>
-        <w:spacing w:after="60" w:before="0" w:line="276"/>
+        <w:pStyle w:val="ListParagraph"/>
+        <w:numPr>
+          <w:ilvl w:val="0"/>
+          <w:numId w:val="1"/>
+        </w:numPr>
+        <w:spacing w:after="60" w:line="276"/>
       </w:pPr>
       <w:r>
         <w:rPr>
@@ -8382,458 +9564,7 @@
           <w:sz w:val="20"/>
           <w:szCs w:val="20"/>
         </w:rPr>
-        <w:t xml:space="preserve"/>
-      </w:r>
-    </w:p>
-    <w:tbl>
-      <w:tblPr>
-        <w:tblW w:type="dxa" w:w="9000"/>
-        <w:tblBorders>
-          <w:top w:val="single" w:color="auto" w:sz="4"/>
-          <w:left w:val="single" w:color="auto" w:sz="4"/>
-          <w:bottom w:val="single" w:color="auto" w:sz="4"/>
-          <w:right w:val="single" w:color="auto" w:sz="4"/>
-          <w:insideH w:val="single" w:color="auto" w:sz="4"/>
-          <w:insideV w:val="single" w:color="auto" w:sz="4"/>
-        </w:tblBorders>
-      </w:tblPr>
-      <w:tblGrid>
-        <w:gridCol w:w="4200"/>
-        <w:gridCol w:w="2400"/>
-        <w:gridCol w:w="2400"/>
-      </w:tblGrid>
-      <w:tr>
-        <w:trPr>
-          <w:tblHeader/>
-        </w:trPr>
-        <w:tc>
-          <w:tcPr>
-            <w:tcW w:type="dxa" w:w="4200"/>
-            <w:shd w:fill="E8E8E8" w:color="auto" w:val="clear"/>
-            <w:tcMar>
-              <w:top w:type="dxa" w:w="60"/>
-              <w:left w:type="dxa" w:w="90"/>
-              <w:bottom w:type="dxa" w:w="60"/>
-              <w:right w:type="dxa" w:w="90"/>
-            </w:tcMar>
-          </w:tcPr>
-          <w:p>
-            <w:pPr>
-              <w:spacing w:after="0" w:line="240"/>
-            </w:pPr>
-            <w:r>
-              <w:rPr>
-                <w:rFonts w:ascii="Times New Roman" w:cs="Times New Roman" w:eastAsia="Times New Roman" w:hAnsi="Times New Roman"/>
-                <w:b/>
-                <w:bCs/>
-                <w:sz w:val="18"/>
-                <w:szCs w:val="18"/>
-              </w:rPr>
-              <w:t xml:space="preserve">Contingency (Claude, provisional)</w:t>
-            </w:r>
-          </w:p>
-        </w:tc>
-        <w:tc>
-          <w:tcPr>
-            <w:tcW w:type="dxa" w:w="2400"/>
-            <w:shd w:fill="E8E8E8" w:color="auto" w:val="clear"/>
-            <w:tcMar>
-              <w:top w:type="dxa" w:w="60"/>
-              <w:left w:type="dxa" w:w="90"/>
-              <w:bottom w:type="dxa" w:w="60"/>
-              <w:right w:type="dxa" w:w="90"/>
-            </w:tcMar>
-          </w:tcPr>
-          <w:p>
-            <w:pPr>
-              <w:spacing w:after="0" w:line="240"/>
-            </w:pPr>
-            <w:r>
-              <w:rPr>
-                <w:rFonts w:ascii="Times New Roman" w:cs="Times New Roman" w:eastAsia="Times New Roman" w:hAnsi="Times New Roman"/>
-                <w:b/>
-                <w:bCs/>
-                <w:sz w:val="18"/>
-                <w:szCs w:val="18"/>
-              </w:rPr>
-              <w:t xml:space="preserve">NQ</w:t>
-            </w:r>
-          </w:p>
-        </w:tc>
-        <w:tc>
-          <w:tcPr>
-            <w:tcW w:type="dxa" w:w="2400"/>
-            <w:shd w:fill="E8E8E8" w:color="auto" w:val="clear"/>
-            <w:tcMar>
-              <w:top w:type="dxa" w:w="60"/>
-              <w:left w:type="dxa" w:w="90"/>
-              <w:bottom w:type="dxa" w:w="60"/>
-              <w:right w:type="dxa" w:w="90"/>
-            </w:tcMar>
-          </w:tcPr>
-          <w:p>
-            <w:pPr>
-              <w:spacing w:after="0" w:line="240"/>
-            </w:pPr>
-            <w:r>
-              <w:rPr>
-                <w:rFonts w:ascii="Times New Roman" w:cs="Times New Roman" w:eastAsia="Times New Roman" w:hAnsi="Times New Roman"/>
-                <w:b/>
-                <w:bCs/>
-                <w:sz w:val="18"/>
-                <w:szCs w:val="18"/>
-              </w:rPr>
-              <w:t xml:space="preserve">HotpotQA</w:t>
-            </w:r>
-          </w:p>
-        </w:tc>
-      </w:tr>
-      <w:tr>
-        <w:trPr>
-          <w:tblHeader w:val="false"/>
-        </w:trPr>
-        <w:tc>
-          <w:tcPr>
-            <w:tcW w:type="dxa" w:w="4200"/>
-            <w:tcMar>
-              <w:top w:type="dxa" w:w="60"/>
-              <w:left w:type="dxa" w:w="90"/>
-              <w:bottom w:type="dxa" w:w="60"/>
-              <w:right w:type="dxa" w:w="90"/>
-            </w:tcMar>
-          </w:tcPr>
-          <w:p>
-            <w:pPr>
-              <w:spacing w:after="0" w:line="240"/>
-            </w:pPr>
-            <w:r>
-              <w:rPr>
-                <w:rFonts w:ascii="Times New Roman" w:cs="Times New Roman" w:eastAsia="Times New Roman" w:hAnsi="Times New Roman"/>
-                <w:b w:val="false"/>
-                <w:bCs w:val="false"/>
-                <w:sz w:val="18"/>
-                <w:szCs w:val="18"/>
-              </w:rPr>
-              <w:t xml:space="preserve">hit and correct</w:t>
-            </w:r>
-          </w:p>
-        </w:tc>
-        <w:tc>
-          <w:tcPr>
-            <w:tcW w:type="dxa" w:w="2400"/>
-            <w:tcMar>
-              <w:top w:type="dxa" w:w="60"/>
-              <w:left w:type="dxa" w:w="90"/>
-              <w:bottom w:type="dxa" w:w="60"/>
-              <w:right w:type="dxa" w:w="90"/>
-            </w:tcMar>
-          </w:tcPr>
-          <w:p>
-            <w:pPr>
-              <w:spacing w:after="0" w:line="240"/>
-            </w:pPr>
-            <w:r>
-              <w:rPr>
-                <w:rFonts w:ascii="Times New Roman" w:cs="Times New Roman" w:eastAsia="Times New Roman" w:hAnsi="Times New Roman"/>
-                <w:b w:val="false"/>
-                <w:bCs w:val="false"/>
-                <w:sz w:val="18"/>
-                <w:szCs w:val="18"/>
-              </w:rPr>
-              <w:t xml:space="preserve">71.8%</w:t>
-            </w:r>
-          </w:p>
-        </w:tc>
-        <w:tc>
-          <w:tcPr>
-            <w:tcW w:type="dxa" w:w="2400"/>
-            <w:tcMar>
-              <w:top w:type="dxa" w:w="60"/>
-              <w:left w:type="dxa" w:w="90"/>
-              <w:bottom w:type="dxa" w:w="60"/>
-              <w:right w:type="dxa" w:w="90"/>
-            </w:tcMar>
-          </w:tcPr>
-          <w:p>
-            <w:pPr>
-              <w:spacing w:after="0" w:line="240"/>
-            </w:pPr>
-            <w:r>
-              <w:rPr>
-                <w:rFonts w:ascii="Times New Roman" w:cs="Times New Roman" w:eastAsia="Times New Roman" w:hAnsi="Times New Roman"/>
-                <w:b w:val="false"/>
-                <w:bCs w:val="false"/>
-                <w:sz w:val="18"/>
-                <w:szCs w:val="18"/>
-              </w:rPr>
-              <w:t xml:space="preserve">67.2%</w:t>
-            </w:r>
-          </w:p>
-        </w:tc>
-      </w:tr>
-      <w:tr>
-        <w:trPr>
-          <w:tblHeader w:val="false"/>
-        </w:trPr>
-        <w:tc>
-          <w:tcPr>
-            <w:tcW w:type="dxa" w:w="4200"/>
-            <w:tcMar>
-              <w:top w:type="dxa" w:w="60"/>
-              <w:left w:type="dxa" w:w="90"/>
-              <w:bottom w:type="dxa" w:w="60"/>
-              <w:right w:type="dxa" w:w="90"/>
-            </w:tcMar>
-          </w:tcPr>
-          <w:p>
-            <w:pPr>
-              <w:spacing w:after="0" w:line="240"/>
-            </w:pPr>
-            <w:r>
-              <w:rPr>
-                <w:rFonts w:ascii="Times New Roman" w:cs="Times New Roman" w:eastAsia="Times New Roman" w:hAnsi="Times New Roman"/>
-                <w:b w:val="false"/>
-                <w:bCs w:val="false"/>
-                <w:sz w:val="18"/>
-                <w:szCs w:val="18"/>
-              </w:rPr>
-              <w:t xml:space="preserve">hit and incorrect</w:t>
-            </w:r>
-          </w:p>
-        </w:tc>
-        <w:tc>
-          <w:tcPr>
-            <w:tcW w:type="dxa" w:w="2400"/>
-            <w:tcMar>
-              <w:top w:type="dxa" w:w="60"/>
-              <w:left w:type="dxa" w:w="90"/>
-              <w:bottom w:type="dxa" w:w="60"/>
-              <w:right w:type="dxa" w:w="90"/>
-            </w:tcMar>
-          </w:tcPr>
-          <w:p>
-            <w:pPr>
-              <w:spacing w:after="0" w:line="240"/>
-            </w:pPr>
-            <w:r>
-              <w:rPr>
-                <w:rFonts w:ascii="Times New Roman" w:cs="Times New Roman" w:eastAsia="Times New Roman" w:hAnsi="Times New Roman"/>
-                <w:b w:val="false"/>
-                <w:bCs w:val="false"/>
-                <w:sz w:val="18"/>
-                <w:szCs w:val="18"/>
-              </w:rPr>
-              <w:t xml:space="preserve">23.3%</w:t>
-            </w:r>
-          </w:p>
-        </w:tc>
-        <w:tc>
-          <w:tcPr>
-            <w:tcW w:type="dxa" w:w="2400"/>
-            <w:tcMar>
-              <w:top w:type="dxa" w:w="60"/>
-              <w:left w:type="dxa" w:w="90"/>
-              <w:bottom w:type="dxa" w:w="60"/>
-              <w:right w:type="dxa" w:w="90"/>
-            </w:tcMar>
-          </w:tcPr>
-          <w:p>
-            <w:pPr>
-              <w:spacing w:after="0" w:line="240"/>
-            </w:pPr>
-            <w:r>
-              <w:rPr>
-                <w:rFonts w:ascii="Times New Roman" w:cs="Times New Roman" w:eastAsia="Times New Roman" w:hAnsi="Times New Roman"/>
-                <w:b w:val="false"/>
-                <w:bCs w:val="false"/>
-                <w:sz w:val="18"/>
-                <w:szCs w:val="18"/>
-              </w:rPr>
-              <w:t xml:space="preserve">30.2%</w:t>
-            </w:r>
-          </w:p>
-        </w:tc>
-      </w:tr>
-      <w:tr>
-        <w:trPr>
-          <w:tblHeader w:val="false"/>
-        </w:trPr>
-        <w:tc>
-          <w:tcPr>
-            <w:tcW w:type="dxa" w:w="4200"/>
-            <w:tcMar>
-              <w:top w:type="dxa" w:w="60"/>
-              <w:left w:type="dxa" w:w="90"/>
-              <w:bottom w:type="dxa" w:w="60"/>
-              <w:right w:type="dxa" w:w="90"/>
-            </w:tcMar>
-          </w:tcPr>
-          <w:p>
-            <w:pPr>
-              <w:spacing w:after="0" w:line="240"/>
-            </w:pPr>
-            <w:r>
-              <w:rPr>
-                <w:rFonts w:ascii="Times New Roman" w:cs="Times New Roman" w:eastAsia="Times New Roman" w:hAnsi="Times New Roman"/>
-                <w:b w:val="false"/>
-                <w:bCs w:val="false"/>
-                <w:sz w:val="18"/>
-                <w:szCs w:val="18"/>
-              </w:rPr>
-              <w:t xml:space="preserve">miss and correct</w:t>
-            </w:r>
-          </w:p>
-        </w:tc>
-        <w:tc>
-          <w:tcPr>
-            <w:tcW w:type="dxa" w:w="2400"/>
-            <w:tcMar>
-              <w:top w:type="dxa" w:w="60"/>
-              <w:left w:type="dxa" w:w="90"/>
-              <w:bottom w:type="dxa" w:w="60"/>
-              <w:right w:type="dxa" w:w="90"/>
-            </w:tcMar>
-          </w:tcPr>
-          <w:p>
-            <w:pPr>
-              <w:spacing w:after="0" w:line="240"/>
-            </w:pPr>
-            <w:r>
-              <w:rPr>
-                <w:rFonts w:ascii="Times New Roman" w:cs="Times New Roman" w:eastAsia="Times New Roman" w:hAnsi="Times New Roman"/>
-                <w:b w:val="false"/>
-                <w:bCs w:val="false"/>
-                <w:sz w:val="18"/>
-                <w:szCs w:val="18"/>
-              </w:rPr>
-              <w:t xml:space="preserve">0.5%</w:t>
-            </w:r>
-          </w:p>
-        </w:tc>
-        <w:tc>
-          <w:tcPr>
-            <w:tcW w:type="dxa" w:w="2400"/>
-            <w:tcMar>
-              <w:top w:type="dxa" w:w="60"/>
-              <w:left w:type="dxa" w:w="90"/>
-              <w:bottom w:type="dxa" w:w="60"/>
-              <w:right w:type="dxa" w:w="90"/>
-            </w:tcMar>
-          </w:tcPr>
-          <w:p>
-            <w:pPr>
-              <w:spacing w:after="0" w:line="240"/>
-            </w:pPr>
-            <w:r>
-              <w:rPr>
-                <w:rFonts w:ascii="Times New Roman" w:cs="Times New Roman" w:eastAsia="Times New Roman" w:hAnsi="Times New Roman"/>
-                <w:b w:val="false"/>
-                <w:bCs w:val="false"/>
-                <w:sz w:val="18"/>
-                <w:szCs w:val="18"/>
-              </w:rPr>
-              <w:t xml:space="preserve">0.2%</w:t>
-            </w:r>
-          </w:p>
-        </w:tc>
-      </w:tr>
-      <w:tr>
-        <w:trPr>
-          <w:tblHeader w:val="false"/>
-        </w:trPr>
-        <w:tc>
-          <w:tcPr>
-            <w:tcW w:type="dxa" w:w="4200"/>
-            <w:tcMar>
-              <w:top w:type="dxa" w:w="60"/>
-              <w:left w:type="dxa" w:w="90"/>
-              <w:bottom w:type="dxa" w:w="60"/>
-              <w:right w:type="dxa" w:w="90"/>
-            </w:tcMar>
-          </w:tcPr>
-          <w:p>
-            <w:pPr>
-              <w:spacing w:after="0" w:line="240"/>
-            </w:pPr>
-            <w:r>
-              <w:rPr>
-                <w:rFonts w:ascii="Times New Roman" w:cs="Times New Roman" w:eastAsia="Times New Roman" w:hAnsi="Times New Roman"/>
-                <w:b w:val="false"/>
-                <w:bCs w:val="false"/>
-                <w:sz w:val="18"/>
-                <w:szCs w:val="18"/>
-              </w:rPr>
-              <w:t xml:space="preserve">miss and incorrect</w:t>
-            </w:r>
-          </w:p>
-        </w:tc>
-        <w:tc>
-          <w:tcPr>
-            <w:tcW w:type="dxa" w:w="2400"/>
-            <w:tcMar>
-              <w:top w:type="dxa" w:w="60"/>
-              <w:left w:type="dxa" w:w="90"/>
-              <w:bottom w:type="dxa" w:w="60"/>
-              <w:right w:type="dxa" w:w="90"/>
-            </w:tcMar>
-          </w:tcPr>
-          <w:p>
-            <w:pPr>
-              <w:spacing w:after="0" w:line="240"/>
-            </w:pPr>
-            <w:r>
-              <w:rPr>
-                <w:rFonts w:ascii="Times New Roman" w:cs="Times New Roman" w:eastAsia="Times New Roman" w:hAnsi="Times New Roman"/>
-                <w:b w:val="false"/>
-                <w:bCs w:val="false"/>
-                <w:sz w:val="18"/>
-                <w:szCs w:val="18"/>
-              </w:rPr>
-              <w:t xml:space="preserve">4.4%</w:t>
-            </w:r>
-          </w:p>
-        </w:tc>
-        <w:tc>
-          <w:tcPr>
-            <w:tcW w:type="dxa" w:w="2400"/>
-            <w:tcMar>
-              <w:top w:type="dxa" w:w="60"/>
-              <w:left w:type="dxa" w:w="90"/>
-              <w:bottom w:type="dxa" w:w="60"/>
-              <w:right w:type="dxa" w:w="90"/>
-            </w:tcMar>
-          </w:tcPr>
-          <w:p>
-            <w:pPr>
-              <w:spacing w:after="0" w:line="240"/>
-            </w:pPr>
-            <w:r>
-              <w:rPr>
-                <w:rFonts w:ascii="Times New Roman" w:cs="Times New Roman" w:eastAsia="Times New Roman" w:hAnsi="Times New Roman"/>
-                <w:b w:val="false"/>
-                <w:bCs w:val="false"/>
-                <w:sz w:val="18"/>
-                <w:szCs w:val="18"/>
-              </w:rPr>
-              <w:t xml:space="preserve">2.4%</w:t>
-            </w:r>
-          </w:p>
-        </w:tc>
-      </w:tr>
-    </w:tbl>
-    <w:p>
-      <w:pPr>
-        <w:spacing w:after="180" w:before="100"/>
-      </w:pPr>
-      <w:r>
-        <w:rPr>
-          <w:rFonts w:ascii="Times New Roman" w:cs="Times New Roman" w:eastAsia="Times New Roman" w:hAnsi="Times New Roman"/>
-          <w:i/>
-          <w:iCs/>
-          <w:sz w:val="17"/>
-          <w:szCs w:val="17"/>
-        </w:rPr>
-        <w:t xml:space="preserve">Table VIII. Retrieval hit against correctness. Computed with string containment, an upper bound on correctness, and therefore provisional — see Limitations.</w:t>
+        <w:t xml:space="preserve">The correct-versus-incorrect faithfulness comparison rests on 44 to 84 attempted wrong answers per cell. Excluding refusals and grading correctness with a judge both reduce that population, and the resulting confidence intervals are 0.08 to 0.13 wide. The tests reported in Section VI-B bear on the general claim and do not resolve individual systems.</w:t>
       </w:r>
     </w:p>
     <w:p>

</xml_diff>